<commit_message>
R4: Copilot Chat can call three Companion tools (syllabi, the Copilot guide, the AI-use log example); fig-alt in a new chunk
Rows A1-55, A1-56, A1-61, A1-69 of RGUI-SURFACES-2026-10.md, applied after the 0.4.0 build confirmed the tools
(Check my R setup, Explain an R error, Check my test choice; on for MC 451 and MC 501). s24 and w12 note the
fig-alt line the Describe group adds when it opens a new Quarto chunk.

Co-Authored-By: Claude Fable 5.1 <noreply@anthropic.com>
</commit_message>
<xml_diff>
--- a/resources/MC451-501-AI-use-log.docx
+++ b/resources/MC451-501-AI-use-log.docx
@@ -273,6 +273,14 @@
       </w:r>
       <w:r>
         <w:t xml:space="preserve">“Copilot in VS Code. I asked for a ggplot() call for a bar chart of tone by viewer band. It gave me working code with default labels. I kept the structure, wrote my own axis labels and caption, and checked each bar against my count() table before keeping it.”</w:t>
+      </w:r>
+    </w:p>
+    <w:p>
+      <w:pPr>
+        <w:pStyle w:val="FirstParagraph"/>
+      </w:pPr>
+      <w:r>
+        <w:t>A second example, for a Copilot exchange that used a Companion tool: “Copilot Chat, using the R Companion’s check-my-test-choice tool. I asked whether a chi-square fit viewer band by channel type. It said the two categorical variables fit. I checked both variable types against Chapter 13 and wrote my own reason.”</w:t>
       </w:r>
     </w:p>
     <w:p>

</xml_diff>